<commit_message>
feat(onboarding): implement complete your profile, uc-1
Co-Authored-By: Claude Opus 5.5 <noreply@anthropic.com>
</commit_message>
<xml_diff>
--- a/docs/frontend screens.docx
+++ b/docs/frontend screens.docx
@@ -153,26 +153,20 @@
         <w:t>Key UI:</w:t>
       </w:r>
       <w:r>
-        <w:t xml:space="preserve"> Display Name input with live availability feedback (any language, must be unique), a live preview of the </w:t>
+        <w:t xml:space="preserve"> Display Name input with live availability feedback (any language, must be unique), an avatar choice between the generated avatar (default, live preview) and the user's Google photo when one exists (no upload control), and a mandatory selector for Preferred Streaming Service with nothing pre-selected.</w:t>
       </w:r>
       <w:r>
         <w:rPr>
           <w:b/>
         </w:rPr>
-        <w:t>generated avatar</w:t>
       </w:r>
-      <w:r>
-        <w:t xml:space="preserve"> (no upload control), and a mandatory selector for </w:t>
-      </w:r>
+      <w:r/>
       <w:r>
         <w:rPr>
           <w:b/>
         </w:rPr>
-        <w:t>Preferred Streaming Service</w:t>
       </w:r>
-      <w:r>
-        <w:t>.</w:t>
-      </w:r>
+      <w:r/>
     </w:p>
     <w:p>
       <w:pPr>
@@ -867,7 +861,7 @@
         <w:t>No image uploads.</w:t>
       </w:r>
       <w:r>
-        <w:t xml:space="preserve"> Avatars and community covers are generated from initials and a colour derived deterministically from the entity id. Google users keep the picture Google supplies. No screen contains an upload control.</w:t>
+        <w:t xml:space="preserve"> Avatars and community covers are generated from initials and a colour derived deterministically from the entity id. Google users may choose the picture Google supplies during onboarding; the generated avatar is the default. No screen contains an upload control.</w:t>
       </w:r>
     </w:p>
     <w:p>

</xml_diff>

<commit_message>
test(communities): cover create and dashboard end to end, uc-9
Unit, integration, component and E2E suites per the spec. The tests
surfaced that the Hebrew geresh was rejected in names; it is now
allowed and keys like an apostrophe. Docs mirrored in md and docx.

Co-Authored-By: Claude Opus 5.5 <noreply@anthropic.com>
</commit_message>
<xml_diff>
--- a/docs/frontend screens.docx
+++ b/docs/frontend screens.docx
@@ -324,7 +324,21 @@
         <w:t>Key UI:</w:t>
       </w:r>
       <w:r>
-        <w:t xml:space="preserve"> List/Grid of joined Communities (Cover Image, Name), "Create New Community" FAB (Floating Action Button) or prominent button, Bottom/Top navigation bar to switch between Home, Search, My List, and Profile.</w:t>
+        <w:t xml:space="preserve"> List of joined Communities (generated cover, name, member count, an "Admin" label where the user is one), newest joined first, and a floating "Create community" button. A bottom tab bar switches between Home, Search, My List, and Profile; Search and My List show a "Coming soon" screen until their phases, and Profile is a minimal screen with Sign out until My Profile / Settings ships.</w:t>
+      </w:r>
+    </w:p>
+    <w:p>
+      <w:pPr>
+        <w:pStyle w:val="ListBullet2"/>
+      </w:pPr>
+      <w:r>
+        <w:rPr>
+          <w:b/>
+        </w:rPr>
+        <w:t>States:</w:t>
+      </w:r>
+      <w:r>
+        <w:t xml:space="preserve"> skeleton cards while loading; an empty state ("Start your first community") with a single Create button; an inline error with Try again.</w:t>
       </w:r>
     </w:p>
     <w:p>
@@ -556,16 +570,21 @@
         <w:t>Key UI:</w:t>
       </w:r>
       <w:r>
-        <w:t xml:space="preserve"> Form for Community Name and Description, a live preview of the </w:t>
+        <w:t xml:space="preserve"> A full-screen form (not a modal, so the phone's back gesture works) for Community Name and Description, with a live preview of the generated cover graphic (neutral until the community exists, since its colour comes from the id; no upload control). In place of the friends multi-select, a static "Invite friends" card until friends exist (Phase 5).</w:t>
       </w:r>
+    </w:p>
+    <w:p>
+      <w:pPr>
+        <w:pStyle w:val="ListBullet2"/>
+      </w:pPr>
       <w:r>
         <w:rPr>
           <w:b/>
         </w:rPr>
-        <w:t>generated cover graphic</w:t>
+        <w:t>States:</w:t>
       </w:r>
       <w:r>
-        <w:t xml:space="preserve"> (no upload control), and a multi-select list of current friends to invite.</w:t>
+        <w:t xml:space="preserve"> required-name error ("A Community name is required."); submitting ("Creating…"); offline banner. On success the user lands on the community's page, which shows the cover, name, description, member line, and a "Posts are coming soon" panel until Phase 3. A community the user is not in renders the standard not-found page.</w:t>
       </w:r>
     </w:p>
     <w:p>

</xml_diff>

<commit_message>
test(communities): cover invites and joining end to end, uc-15
Unit, integration, component and E2E suites per the spec. The E2E loop
caught a new user losing the pending invite after onboarding; it is now
cleared on explicit sign-out only. Docs mirrored in md and docx.

Co-Authored-By: Claude Opus 5.5 <noreply@anthropic.com>
</commit_message>
<xml_diff>
--- a/docs/frontend screens.docx
+++ b/docs/frontend screens.docx
@@ -227,10 +227,10 @@
         <w:rPr>
           <w:b/>
         </w:rPr>
-        <w:t>thirteen</w:t>
+        <w:t>fourteen</w:t>
       </w:r>
       <w:r>
-        <w:t xml:space="preserve"> screens. (It previously held sixteen; the "thirteen" figure quoted in earlier drafts of CLAUDE.md never matched the actual list and has been corrected.)</w:t>
+        <w:t xml:space="preserve"> screens (thirteen after the withdrawal, plus Join Community / Invite Preview, added with UC-15 in Phase 2). (It previously held sixteen; the "thirteen" figure quoted in earlier drafts of CLAUDE.md never matched the actual list and has been corrected.)</w:t>
       </w:r>
     </w:p>
     <w:p>
@@ -623,7 +623,7 @@
         <w:t>Key UI:</w:t>
       </w:r>
       <w:r>
-        <w:t xml:space="preserve"> List of current members. For Admins: "Generate Invite Link" button, "Remove User" actions next to member names. For all members: "Leave Community" button.</w:t>
+        <w:t xml:space="preserve"> List of current members. For Admins: "Remove User" actions next to member names, and the invite panel. For all members: "Leave Community" button. Until this screen exists, Admins open the invite panel from an "Invite friends" button on the community page: the link, Share (the iPhone share sheet), Copy, and Reset link with a confirmation. It also opens once by itself right after a community is created.</w:t>
       </w:r>
     </w:p>
     <w:p>
@@ -663,6 +663,59 @@
       </w:r>
       <w:r>
         <w:t xml:space="preserve"> The primary song card at the top, a large average rating display, and a scrolling list of individual member reviews (User, Star Rating, Text Comment, Timestamp).</w:t>
+      </w:r>
+    </w:p>
+    <w:p>
+      <w:pPr>
+        <w:pStyle w:val="ListBullet"/>
+      </w:pPr>
+      <w:r>
+        <w:rPr>
+          <w:b/>
+        </w:rPr>
+        <w:t>3.5. Join Community / Invite Preview (UC-15)</w:t>
+      </w:r>
+    </w:p>
+    <w:p>
+      <w:pPr>
+        <w:pStyle w:val="ListBullet2"/>
+      </w:pPr>
+      <w:r>
+        <w:rPr>
+          <w:b/>
+        </w:rPr>
+        <w:t>Purpose:</w:t>
+      </w:r>
+      <w:r>
+        <w:t xml:space="preserve"> What a friend sees when they open an invite link — signed in or not, with an account or not.</w:t>
+      </w:r>
+    </w:p>
+    <w:p>
+      <w:pPr>
+        <w:pStyle w:val="ListBullet2"/>
+      </w:pPr>
+      <w:r>
+        <w:rPr>
+          <w:b/>
+        </w:rPr>
+        <w:t>Key UI:</w:t>
+      </w:r>
+      <w:r>
+        <w:t xml:space="preserve"> The community's generated cover, name and member count under "You're invited to". Signed out: the Google sign-in with "Continue with Google to join"; a new user completes their profile and returns here. Signed in: a "Join community" button, or "You're already in this community." with an Open link.</w:t>
+      </w:r>
+    </w:p>
+    <w:p>
+      <w:pPr>
+        <w:pStyle w:val="ListBullet2"/>
+      </w:pPr>
+      <w:r>
+        <w:rPr>
+          <w:b/>
+        </w:rPr>
+        <w:t>States:</w:t>
+      </w:r>
+      <w:r>
+        <w:t xml:space="preserve"> loading skeleton; joining ("Joining…"); invalid or reset link (the UC-15 message, with a link home); other load failure (Try again); offline (Join disabled).</w:t>
       </w:r>
     </w:p>
     <w:p>

</xml_diff>

<commit_message>
test(communities): cover membership management end to end
Unit, integration, component and E2E suites per the spec, including the
one-owner index, the owner backfill and the race branches. UC-10 and
UC-14; docs mirrored in md and docx; schema is now eight tables.

Co-Authored-By: Claude Opus 5.5 <noreply@anthropic.com>
</commit_message>
<xml_diff>
--- a/docs/frontend screens.docx
+++ b/docs/frontend screens.docx
@@ -620,10 +620,24 @@
         <w:rPr>
           <w:b/>
         </w:rPr>
-        <w:t>Key UI:</w:t>
+        <w:t xml:space="preserve">Key UI:</w:t>
       </w:r>
       <w:r>
-        <w:t xml:space="preserve"> List of current members. For Admins: "Remove User" actions next to member names, and the invite panel. For all members: "Leave Community" button. Until this screen exists, Admins open the invite panel from an "Invite friends" button on the community page: the link, Share (the iPhone share sheet), Copy, and Reset link with a confirmation. It also opens once by itself right after a community is created.</w:t>
+        <w:t xml:space="preserve"> Opened from a "Settings" button on the community page. Everyone: the member list (avatar, name, "You", an "Owner" / "Admin" label) and "Leave community" with a confirmation — the Owner instead sees the transfer-or-delete message. Admins: editable name and description with "Save changes"; the invite panel (also on the community page, and opening once by itself after a community is created); a ⋯ menu on rows they may act on — "Make admin", "Make member", "Remove from community" (confirmation; removal also blocks); and a "Blocked" list with "Unblock". The Owner additionally: "Make owner" (confirmation) and "Delete community", confirmed with a warning and an "I understand this can't be undone" checkbox.</w:t>
+      </w:r>
+    </w:p>
+    <w:p>
+      <w:pPr>
+        <w:pStyle w:val="ListBullet2"/>
+      </w:pPr>
+      <w:r>
+        <w:rPr>
+          <w:b/>
+        </w:rPr>
+        <w:t xml:space="preserve">States:</w:t>
+      </w:r>
+      <w:r>
+        <w:t xml:space="preserve"> loading skeleton; load error with Try again; not a member → the standard not-found page; actions in progress keep their sheet open; offline banner disables every action while the list stays readable.</w:t>
       </w:r>
     </w:p>
     <w:p>

</xml_diff>

<commit_message>
test(admin): cover settings, banner, history and e2e, uc-19
Unit and integration tests for the settings registry and endpoints
(rules, no-ops, history, deleted author, 401/403/422, keys-not-texts
log); component tests for the Settings tab, banner, loader and the
Welcome tagline; API-module tests including two missed earlier; one
Chromium-only E2E loop. Tables and frontend screens updated in .md and
.docx; CLAUDE.md and DEVELOPMENT.md step 2.9.

Co-Authored-By: Claude Opus 5.5 <noreply@anthropic.com>
</commit_message>
<xml_diff>
--- a/docs/frontend screens.docx
+++ b/docs/frontend screens.docx
@@ -1075,7 +1075,7 @@
         <w:t>/admin/settings</w:t>
       </w:r>
       <w:r>
-        <w:t xml:space="preserve">): arrives with Part 2 of the spec - the announcement banner, accent colour and Welcome tagline, with the history of changes.</w:t>
+        <w:t xml:space="preserve">): an on/off switch and text (up to 140 characters) for the announcement banner; five named accent colours as swatches; the Welcome tagline (up to 80 characters) with "Reset to default". One "Save changes", enabled only once something changed and everything is valid, sends only what changed and toasts "Settings saved"; field problems show under the field, other failures inline; offline disables Save. Below, the last 20 changes, e.g. "Ofri changed the accent colour from Purple to Green", with "Deleted account" for an author whose account is gone.</w:t>
       </w:r>
     </w:p>
     <w:p>
@@ -1083,7 +1083,21 @@
         <w:pStyle w:val="ListBullet2"/>
       </w:pPr>
       <w:r>
-        <w:t xml:space="preserve">Rows are read-only; nothing opens a profile or a community, and nothing deletes anything.</w:t>
+        <w:t xml:space="preserve">List rows are read-only; nothing opens a profile or a community, and nothing deletes anything.</w:t>
+      </w:r>
+    </w:p>
+    <w:p>
+      <w:pPr>
+        <w:pStyle w:val="ListBullet2"/>
+      </w:pPr>
+      <w:r>
+        <w:rPr>
+          <w:b/>
+        </w:rPr>
+        <w:t xml:space="preserve">How the settings apply</w:t>
+      </w:r>
+      <w:r>
+        <w:t xml:space="preserve"> (everywhere, not just here): the app fetches them at start without waiting on them, defaults until then or on failure. The accent colour is applied app-wide by name; the tagline is Welcome's subtitle; the banner is a slim plain-text bar at the top of every tabbed screen for signed-in users, dismissible, and shown again when its text changes. Other users get a change on their next app load.</w:t>
       </w:r>
     </w:p>
     <w:p>

</xml_diff>

<commit_message>
docs(posts): update specs, guide and roadmap for the posts feed, uc-11
tables, use cases, frontend screens, link converter guide, tech stack and tests (.md + .docx); CLAUDE.md §7; DEVELOPMENT.md Step 3.1.

Co-Authored-By: Claude Opus 5.5 <noreply@anthropic.com>
</commit_message>
<xml_diff>
--- a/docs/frontend screens.docx
+++ b/docs/frontend screens.docx
@@ -515,7 +515,7 @@
         <w:pStyle w:val="ListBullet3"/>
       </w:pPr>
       <w:r>
-        <w:t>Input area: URL paste box and optional text comment field.</w:t>
+        <w:t xml:space="preserve">Input area: URL paste box and optional comment (counter n/280) with Post. While the link converts, the button reads "Finding this track on other services…" and the fields are read-only; an invalid link shows the UC-11 message under the field with the draft kept.</w:t>
       </w:r>
     </w:p>
     <w:p>
@@ -523,7 +523,7 @@
         <w:pStyle w:val="ListBullet3"/>
       </w:pPr>
       <w:r>
-        <w:t>Feed of Post Cards: Each card shows the song metadata (Cover Art, Title, Artist), the author's comment, a "Save to Listen Later" bookmark icon, and an average star rating.</w:t>
+        <w:t xml:space="preserve">Feed of Post Cards, newest first with Load more: the author and time, cover art, title, artist, an "Album" label for albums, the comment, an "Open in {your service}" button (the original link when your service has no match) and "Other services" (a sheet of every link). A post saved during an outage reads "Shared from {service}" with "Other services unavailable", and its author sees "Find on other services". The bookmark icon and average rating arrive in Phase 4 (UC-12, UC-16).</w:t>
       </w:r>
     </w:p>
     <w:p>
@@ -531,7 +531,15 @@
         <w:pStyle w:val="ListBullet3"/>
       </w:pPr>
       <w:r>
-        <w:t>Context menu on own posts to "Delete Post".</w:t>
+        <w:t xml:space="preserve">Context menu on own posts to "Delete Post" — arrives with Step 3.5 (UC-18).</w:t>
+      </w:r>
+    </w:p>
+    <w:p>
+      <w:pPr>
+        <w:pStyle w:val="ListBullet3"/>
+      </w:pPr>
+      <w:r>
+        <w:t xml:space="preserve">States: post skeletons while loading; "Share the first song" when empty; "Couldn't load posts." with Try again; offline banner "You're offline. Connect to post." with posting disabled while the feed stays readable. Detail: docs/features/posts-feed.md §5.</w:t>
       </w:r>
     </w:p>
     <w:p>
@@ -623,7 +631,7 @@
         <w:t xml:space="preserve">Key UI:</w:t>
       </w:r>
       <w:r>
-        <w:t xml:space="preserve"> Opened from a "Settings" button on the community page. Everyone: the member list (avatar, name, "You", an "Owner" / "Admin" label) and "Leave community" with a confirmation — the Owner instead sees the transfer-or-delete message. Admins: editable name and description with "Save changes"; the invite panel (also on the community page, and opening once by itself after a community is created); a ⋯ menu on rows they may act on — "Make admin", "Make member", "Remove from community" (confirmation; removal also blocks); and a "Blocked" list with "Unblock". The Owner additionally: "Make owner" (confirmation) and "Delete community", confirmed with a warning and an "I understand this can't be undone" checkbox.</w:t>
+        <w:t xml:space="preserve"> Opened from a "Settings" button on the community page. Everyone: the member list (avatar, name, "You", an "Owner" / "Admin" label) and "Leave community" with a confirmation — the Owner instead sees the transfer-or-delete message. Admins: editable name and description with "Save changes"; the invite panel (also on the community page, and opening once by itself after a community is created); a ⋯ menu on rows they may act on — "Make admin", "Make member", "Remove from community" (confirmation; removal also blocks and deletes their posts here); and a "Blocked" list with "Unblock". The Owner additionally: "Make owner" (confirmation) and "Delete community", confirmed with a warning and an "I understand this can't be undone" checkbox.</w:t>
       </w:r>
     </w:p>
     <w:p>

</xml_diff>

<commit_message>
docs(bookmarks): record bookmarks in the specs and the log, uc-12
tables, use cases (UC-12, UC-14) and frontend screens in .md and .docx;
DEVELOPMENT.md Step 4.1.

Co-Authored-By: Claude Opus 5.5 <noreply@anthropic.com>
</commit_message>
<xml_diff>
--- a/docs/frontend screens.docx
+++ b/docs/frontend screens.docx
@@ -523,7 +523,7 @@
         <w:pStyle w:val="ListBullet3"/>
       </w:pPr>
       <w:r>
-        <w:t xml:space="preserve">Feed of Post Cards, newest first with Load more: the author and time, cover art, title, artist, an "Album" label for albums, the comment, an "Open in {your service}" button (the original link when your service has no match) and "Other services" (a sheet of every link). A post saved during an outage reads "Shared from {service}" with "Other services unavailable", and its author sees "Find on other services". The bookmark icon and average rating arrive in Phase 4 (UC-12, UC-16).</w:t>
+        <w:t xml:space="preserve">Feed of Post Cards, newest first with Load more: the author and time, cover art, title, artist, an "Album" label for albums, the comment, an "Open in {your service}" button (the original link when your service has no match) and "Other services" (a sheet of every link). A post saved during an outage reads "Shared from {service}" with "Other services unavailable", and its author sees "Find on other services". On other people's posts, a bookmark icon saves to Listen Later: outline or filled, with "Added to Listen Later" / "Removed from Listen Later" toasts, disabled offline (UC-12, docs/features/bookmarks-my-list.md). The average rating arrives with UC-16.</w:t>
       </w:r>
     </w:p>
     <w:p>
@@ -761,7 +761,7 @@
         <w:rPr>
           <w:b/>
         </w:rPr>
-        <w:t>4.1. "My List" / Listen Later Screen (UC-13)</w:t>
+        <w:t>4.1. "My List" / Listen Later Screen (UC-12, UC-13)</w:t>
       </w:r>
     </w:p>
     <w:p>
@@ -789,7 +789,7 @@
         <w:t>Key UI:</w:t>
       </w:r>
       <w:r>
-        <w:t xml:space="preserve"> List of saved song cards. Tapping a card opens it in their preferred external music app. Each card has a prominent "Rate &amp; Review" action button.</w:t>
+        <w:t xml:space="preserve"> List of saved song cards, newest saved first: cover, title, artist, "Shared by {author} in {community}" (the community links to its page while you are a member; songs from a community you left stay) and when it was saved. "Open in {your service}" opens it in their preferred music app, falling back to the original link; "Remove" takes it off the list at once. Each card gains a prominent "Rate &amp; Review" action button with UC-13. States: card skeletons; "Nothing saved yet"; "Couldn't load your list." with Try again; Load more; offline banner with Remove disabled (docs/features/bookmarks-my-list.md).</w:t>
       </w:r>
     </w:p>
     <w:p>

</xml_diff>

<commit_message>
docs(ratings): record ratings in the specs and the log, uc-13
tables, use cases (UC-12, UC-13) and frontend screens in .md and .docx;
CLAUDE.md §6 (the score CHECK); DEVELOPMENT.md Step 4.2.

Co-Authored-By: Claude Opus 5.5 <noreply@anthropic.com>
</commit_message>
<xml_diff>
--- a/docs/frontend screens.docx
+++ b/docs/frontend screens.docx
@@ -523,7 +523,7 @@
         <w:pStyle w:val="ListBullet3"/>
       </w:pPr>
       <w:r>
-        <w:t xml:space="preserve">Feed of Post Cards, newest first with Load more: the author and time, cover art, title, artist, an "Album" label for albums, the comment, an "Open in {your service}" button (the original link when your service has no match) and "Other services" (a sheet of every link). A post saved during an outage reads "Shared from {service}" with "Other services unavailable", and its author sees "Find on other services". On other people's posts, a bookmark icon saves to Listen Later: outline or filled, with "Added to Listen Later" / "Removed from Listen Later" toasts, disabled offline (UC-12, docs/features/bookmarks-my-list.md). The average rating arrives with UC-16.</w:t>
+        <w:t xml:space="preserve">Feed of Post Cards, newest first with Load more: the author and time, cover art, title, artist, an "Album" label for albums, the comment, an "Open in {your service}" button (the original link when your service has no match) and "Other services" (a sheet of every link). A post saved during an outage reads "Shared from {service}" with "Other services unavailable", and its author sees "Find on other services". On other people's posts, a bookmark icon saves to Listen Later: outline or filled, with "Added to Listen Later" / "Removed from Listen Later" toasts, disabled offline (UC-12, docs/features/bookmarks-my-list.md). Once the viewer has rated a post, the bookmark is replaced by "You rated {n}/10" (docs/features/rate-post.md). The average rating arrives with UC-16.</w:t>
       </w:r>
     </w:p>
     <w:p>
@@ -789,7 +789,7 @@
         <w:t>Key UI:</w:t>
       </w:r>
       <w:r>
-        <w:t xml:space="preserve"> List of saved song cards, newest saved first: cover, title, artist, "Shared by {author} in {community}" (the community links to its page while you are a member; songs from a community you left stay) and when it was saved. "Open in {your service}" opens it in their preferred music app, falling back to the original link; "Remove" takes it off the list at once. Each card gains a prominent "Rate &amp; Review" action button with UC-13. States: card skeletons; "Nothing saved yet"; "Couldn't load your list." with Try again; Load more; offline banner with Remove disabled (docs/features/bookmarks-my-list.md).</w:t>
+        <w:t xml:space="preserve"> List of saved song cards, newest saved first: cover, title, artist, "Shared by {author} in {community}" (the community links to its page while you are a member; songs from a community you left stay) and when it was saved. "Open in {your service}" opens it in their preferred music app, falling back to the original link; "Remove" takes it off the list at once. Each card has a prominent "Rate &amp; Review" button that opens the rating sheet (4.2); for a community the user is no longer in, the line "You're no longer in {community}" replaces it. States: card skeletons; "Nothing saved yet"; "Couldn't load your list." with Try again; Load more; offline banner with Remove and Rate &amp; Review disabled (docs/features/bookmarks-my-list.md).</w:t>
       </w:r>
     </w:p>
     <w:p>
@@ -828,7 +828,7 @@
         <w:t>Key UI:</w:t>
       </w:r>
       <w:r>
-        <w:t xml:space="preserve"> 1-10 Star selection mechanism (slider or interactive stars), optional text input for a review, and a "Submit Rating" button.</w:t>
+        <w:t xml:space="preserve"> A sheet titled "Rate &amp; Review" with the song, ten score options 1-10 ("Your score"), an optional comment with a counter (n/280), and a "Submit Rating" button, disabled until a score is chosen. Submitting shows "Submitting…"; success toasts "Rating submitted" and the song leaves My List; a deleted post leaves with UC-13's message, a second rating with "You already rated this post."; validation and network errors stay inline with the draft kept; offline disables Submit (docs/features/rate-post.md §5.2).</w:t>
       </w:r>
     </w:p>
     <w:p>

</xml_diff>

<commit_message>
docs(ratings): record post detail in the specs and the log, uc-16
tables, use cases (UC-13, UC-14, UC-16) and frontend screens in .md and .docx;
earlier specs' removal line; DEVELOPMENT.md Step 4.4 and Phase 4 complete.

Co-Authored-By: Claude Opus 5.5 <noreply@anthropic.com>
</commit_message>
<xml_diff>
--- a/docs/frontend screens.docx
+++ b/docs/frontend screens.docx
@@ -523,7 +523,7 @@
         <w:pStyle w:val="ListBullet3"/>
       </w:pPr>
       <w:r>
-        <w:t xml:space="preserve">Feed of Post Cards, newest first with Load more: the author and time, cover art, title, artist, an "Album" label for albums, the comment, an "Open in {your service}" button (the original link when your service has no match) and "Other services" (a sheet of every link). A post saved during an outage reads "Shared from {service}" with "Other services unavailable", and its author sees "Find on other services". On other people's posts, a bookmark icon saves to Listen Later: outline or filled, with "Added to Listen Later" / "Removed from Listen Later" toasts, disabled offline (UC-12, docs/features/bookmarks-my-list.md). Once the viewer has rated a post, the bookmark is replaced by "You rated {n}/10" (docs/features/rate-post.md). The average rating arrives with UC-16.</w:t>
+        <w:t xml:space="preserve">Feed of Post Cards, newest first with Load more: the author and time, cover art, title, artist, an "Album" label for albums, the comment, an "Open in {your service}" button (the original link when your service has no match) and "Other services" (a sheet of every link). A post saved during an outage reads "Shared from {service}" with "Other services unavailable", and its author sees "Find on other services". On other people's posts, a bookmark icon saves to Listen Later: outline or filled, with "Added to Listen Later" / "Removed from Listen Later" toasts, disabled offline (UC-12, docs/features/bookmarks-my-list.md). Once the viewer has rated a post, the bookmark is replaced by "You rated {n}/10" (docs/features/rate-post.md). Under the song, "★ {average} · {n} ratings" once someone has rated, and a "View ratings" link to Post Detail (the title links there too; UC-16).</w:t>
       </w:r>
     </w:p>
     <w:p>
@@ -631,7 +631,7 @@
         <w:t xml:space="preserve">Key UI:</w:t>
       </w:r>
       <w:r>
-        <w:t xml:space="preserve"> Opened from a "Settings" button on the community page. Everyone: the member list (avatar, name, "You", an "Owner" / "Admin" label) and "Leave community" with a confirmation — the Owner instead sees the transfer-or-delete message. Admins: editable name and description with "Save changes"; the invite panel (also on the community page, and opening once by itself after a community is created); a ⋯ menu on rows they may act on — "Make admin", "Make member", "Remove from community" (confirmation; removal also blocks and deletes their posts here); and a "Blocked" list with "Unblock". The Owner additionally: "Make owner" (confirmation) and "Delete community", confirmed with a warning and an "I understand this can't be undone" checkbox.</w:t>
+        <w:t xml:space="preserve"> Opened from a "Settings" button on the community page. Everyone: the member list (avatar, name, "You", an "Owner" / "Admin" label) and "Leave community" with a confirmation — the Owner instead sees the transfer-or-delete message. Admins: editable name and description with "Save changes"; the invite panel (also on the community page, and opening once by itself after a community is created); a ⋯ menu on rows they may act on — "Make admin", "Make member", "Remove from community" (confirmation; removal also blocks and deletes their posts and ratings here); and a "Blocked" list with "Unblock". The Owner additionally: "Make owner" (confirmation) and "Delete community", confirmed with a warning and an "I understand this can't be undone" checkbox.</w:t>
       </w:r>
     </w:p>
     <w:p>
@@ -684,7 +684,7 @@
         <w:t>Key UI:</w:t>
       </w:r>
       <w:r>
-        <w:t xml:space="preserve"> The primary song card at the top, a large average rating display, and a scrolling list of individual member reviews (User, Star Rating, Text Comment, Timestamp).</w:t>
+        <w:t xml:space="preserve"> At /posts/:id. A back link to the community; the song card as in the feed (its ⋯ menu deletes the post and returns to the community); a large average ("7.5 out of 10 · 4 ratings", or "No ratings yet"); and every member's rating, newest first: avatar, name ("You" for yours), score n/10, comment and time. Your own rating has "Edit", which opens the rating sheet pre-filled ("Edit your rating", "Save changes", toast "Rating updated"). States: skeletons; a post you cannot see shows the not-found page; "Could not load comments at this time." with Try again while the card stays; offline disables Edit (docs/features/post-detail.md).</w:t>
       </w:r>
     </w:p>
     <w:p>

</xml_diff>

<commit_message>
docs: record find people in specs and development log, uc-5
UC-5, the Global Search and Public User Profile screens, and the ratings
index in tables (.md + .docx); Step 5.1's entry in DEVELOPMENT.md; the
spec's Stage 4 notes; post-detail.md ticked as merged.

Co-Authored-By: Claude Opus 5.5 <noreply@anthropic.com>
</commit_message>
<xml_diff>
--- a/docs/frontend screens.docx
+++ b/docs/frontend screens.docx
@@ -324,7 +324,7 @@
         <w:t>Key UI:</w:t>
       </w:r>
       <w:r>
-        <w:t xml:space="preserve"> List of joined Communities (generated cover, name, member count, an "Admin" label where the user is one), newest joined first, and a floating "Create community" button. A bottom tab bar switches between Home, Search, My List, and Profile; Search and My List show a "Coming soon" screen until their phases, and Profile is My Profile / Settings (4.3).</w:t>
+        <w:t xml:space="preserve"> List of joined Communities (generated cover, name, member count, an "Admin" label where the user is one), newest joined first, and a floating "Create community" button. A bottom tab bar switches between Home, Search, My List, and Profile; Search is Global Search (2.2), My List is 4.1, and Profile is My Profile / Settings (4.3).</w:t>
       </w:r>
     </w:p>
     <w:p>
@@ -377,7 +377,7 @@
         <w:t>Key UI:</w:t>
       </w:r>
       <w:r>
-        <w:t xml:space="preserve"> Search input bar, dynamic list of results (Profile Picture, Display Name), "No results found" empty state.</w:t>
+        <w:t xml:space="preserve"> The Search tab: a field that searches as you type (the query is kept in the URL, so Back restores it) and a list of results — avatar and display name, "You" on your own row — each opening the Public User Profile (yours opens My Profile). Matching ignores case and accents, names starting with the query first, at most 20 with "Showing the first 20. Type more of the name to narrow it down." States: a hint before typing ("Find friends by their display name."); skeleton rows; UC-5's empty state; "Couldn't search right now." with Try again; offline banner with the field disabled (docs/features/find-people.md §5.1).</w:t>
       </w:r>
     </w:p>
     <w:p>
@@ -427,7 +427,7 @@
         <w:rPr>
           <w:b/>
         </w:rPr>
-        <w:t>2.4. Public User Profile Screen (UC-6)</w:t>
+        <w:t>2.4. Public User Profile Screen (UC-5, UC-6)</w:t>
       </w:r>
     </w:p>
     <w:p>
@@ -455,7 +455,7 @@
         <w:t>Key UI:</w:t>
       </w:r>
       <w:r>
-        <w:t xml:space="preserve"> User's display name, avatar, preferred service icon, rating history (their past reviews), and a dynamic connection button ("Add Friend", "Request Sent", or "Friends").</w:t>
+        <w:t xml:space="preserve"> At /users/:id. The person's avatar, display name and "Listens on {service}"; their ratings in communities you share, newest first with Load more, each showing the song (or "Shared from {service}"), the score, the comment, the community and the time, and opening Post Detail. The same profile opens from any name on a post card, a Post Detail rating or a Community Settings member row; your own id opens My Profile. A dynamic connection button ("Add Friend", "Request Sent", or "Friends") arrives with friend requests (Phase 5, Step 5.2). States: skeletons; "No ratings to show" for someone you share no community with; the ratings fail separately ("Couldn't load ratings." with Try again) while the header stays; an unknown user shows the not-found page (docs/features/find-people.md §5.2).</w:t>
       </w:r>
     </w:p>
     <w:p>

</xml_diff>

<commit_message>
docs: record friend requests in specs and development log, uc-6
UC-6 and UC-7, the Friends & Requests and profile screens, and the
friends table (.md + .docx); CLAUDE.md §6 lists the two hand-written
friends objects; Step 5.2's entry in DEVELOPMENT.md.

Co-Authored-By: Claude Opus 5.5 <noreply@anthropic.com>
</commit_message>
<xml_diff>
--- a/docs/frontend screens.docx
+++ b/docs/frontend screens.docx
@@ -324,7 +324,7 @@
         <w:t>Key UI:</w:t>
       </w:r>
       <w:r>
-        <w:t xml:space="preserve"> List of joined Communities (generated cover, name, member count, an "Admin" label where the user is one), newest joined first, and a floating "Create community" button. A bottom tab bar switches between Home, Search, My List, and Profile; Search is Global Search (2.2), My List is 4.1, and Profile is My Profile / Settings (4.3).</w:t>
+        <w:t xml:space="preserve"> List of joined Communities (generated cover, name, member count, an "Admin" label where the user is one), newest joined first, and a floating "Create community" button. A bottom tab bar switches between Home, Search, Friends, My List, and Profile; Search is Global Search (2.2), Friends is 2.3 (with a badge counting pending requests, "9+" above nine), My List is 4.1, and Profile is My Profile / Settings (4.3).</w:t>
       </w:r>
     </w:p>
     <w:p>
@@ -416,7 +416,7 @@
         <w:t>Key UI:</w:t>
       </w:r>
       <w:r>
-        <w:t xml:space="preserve"> Two tabs or sections: "My Friends" (with a "Remove Friend" option) and "Pending Requests" (with "Accept" and "Ignore" actions).</w:t>
+        <w:t xml:space="preserve"> The Friends tab (/friends). "Requests", newest first, each with the sender's name (linking to their profile), when it was sent, "Accept" and "Ignore"; then "Your friends", alphabetical, each linking to their profile ("Remove Friend" arrives with UC-8). Accept toasts "You're now friends with {name}."; a request that is gone toasts the server's message and leaves the list. States: skeletons; "No friends yet" with a link to Search; "Couldn't load your friends." with Try again; offline banner with Accept and Ignore disabled (docs/features/friend-requests.md §5.2).</w:t>
       </w:r>
     </w:p>
     <w:p>
@@ -455,7 +455,7 @@
         <w:t>Key UI:</w:t>
       </w:r>
       <w:r>
-        <w:t xml:space="preserve"> At /users/:id. The person's avatar, display name and "Listens on {service}"; their ratings in communities you share, newest first with Load more, each showing the song (or "Shared from {service}"), the score, the comment, the community and the time, and opening Post Detail. The same profile opens from any name on a post card, a Post Detail rating or a Community Settings member row; your own id opens My Profile. A dynamic connection button ("Add Friend", "Request Sent", or "Friends") arrives with friend requests (Phase 5, Step 5.2). States: skeletons; "No ratings to show" for someone you share no community with; the ratings fail separately ("Couldn't load ratings." with Try again) while the header stays; an unknown user shows the not-found page (docs/features/find-people.md §5.2).</w:t>
+        <w:t xml:space="preserve"> At /users/:id. The person's avatar, display name and "Listens on {service}"; their ratings in communities you share, newest first with Load more, each showing the song (or "Shared from {service}"), the score, the comment, the community and the time, and opening Post Detail. The same profile opens from any name on a post card, a Post Detail rating or a Community Settings member row; your own id opens My Profile. Under the header, the friend control: "Add Friend"; "Request sent" (a sheet with "Cancel request"); "Respond" (a sheet with "Accept" and "Ignore"); or a "Friends" label (docs/features/friend-requests.md §5.3). States: skeletons; "No ratings to show" for someone you share no community with; the ratings fail separately ("Couldn't load ratings." with Try again) while the header stays; an unknown user shows the not-found page (docs/features/find-people.md §5.2).</w:t>
       </w:r>
     </w:p>
     <w:p>

</xml_diff>

<commit_message>
docs: record unfriend in specs and development log, uc-8
UC-8, the Friends & Requests and profile screens, and the friends table
(.md + .docx); Step 5.3's entry in DEVELOPMENT.md.

Co-Authored-By: Claude Opus 5.5 <noreply@anthropic.com>
</commit_message>
<xml_diff>
--- a/docs/frontend screens.docx
+++ b/docs/frontend screens.docx
@@ -416,7 +416,7 @@
         <w:t>Key UI:</w:t>
       </w:r>
       <w:r>
-        <w:t xml:space="preserve"> The Friends tab (/friends). "Requests", newest first, each with the sender's name (linking to their profile), when it was sent, "Accept" and "Ignore"; then "Your friends", alphabetical, each linking to their profile ("Remove Friend" arrives with UC-8). Accept toasts "You're now friends with {name}."; a request that is gone toasts the server's message and leaves the list. States: skeletons; "No friends yet" with a link to Search; "Couldn't load your friends." with Try again; offline banner with Accept and Ignore disabled (docs/features/friend-requests.md §5.2).</w:t>
+        <w:t xml:space="preserve"> The Friends tab (/friends). "Requests", newest first, each with the sender's name (linking to their profile), when it was sent, "Accept" and "Ignore"; then "Your friends", alphabetical, each linking to their profile, with a ⋯ that opens "Remove friend?" ("Remove {name} from your friends? They won't be notified.", Remove friend / Cancel; UC-8, docs/features/unfriend.md). Accept toasts "You're now friends with {name}."; a request that is gone toasts the server's message and leaves the list. States: skeletons; "No friends yet" with a link to Search; "Couldn't load your friends." with Try again; offline banner with Accept and Ignore disabled (docs/features/friend-requests.md §5.2).</w:t>
       </w:r>
     </w:p>
     <w:p>
@@ -455,7 +455,7 @@
         <w:t>Key UI:</w:t>
       </w:r>
       <w:r>
-        <w:t xml:space="preserve"> At /users/:id. The person's avatar, display name and "Listens on {service}"; their ratings in communities you share, newest first with Load more, each showing the song (or "Shared from {service}"), the score, the comment, the community and the time, and opening Post Detail. The same profile opens from any name on a post card, a Post Detail rating or a Community Settings member row; your own id opens My Profile. Under the header, the friend control: "Add Friend"; "Request sent" (a sheet with "Cancel request"); "Respond" (a sheet with "Accept" and "Ignore"); or a "Friends" label (docs/features/friend-requests.md §5.3). States: skeletons; "No ratings to show" for someone you share no community with; the ratings fail separately ("Couldn't load ratings." with Try again) while the header stays; an unknown user shows the not-found page (docs/features/find-people.md §5.2).</w:t>
+        <w:t xml:space="preserve"> At /users/:id. The person's avatar, display name and "Listens on {service}"; their ratings in communities you share, newest first with Load more, each showing the song (or "Shared from {service}"), the score, the comment, the community and the time, and opening Post Detail. The same profile opens from any name on a post card, a Post Detail rating or a Community Settings member row; your own id opens My Profile. Under the header, the friend control: "Add Friend"; "Request sent" (a sheet with "Cancel request"); "Respond" (a sheet with "Accept" and "Ignore"); or a "Friends" button that opens the same "Remove friend?" sheet (docs/features/friend-requests.md §5.3). States: skeletons; "No ratings to show" for someone you share no community with; the ratings fail separately ("Couldn't load ratings." with Try again) while the header stays; an unknown user shows the not-found page (docs/features/find-people.md §5.2).</w:t>
       </w:r>
     </w:p>
     <w:p>

</xml_diff>

<commit_message>
docs: record inviting friends in specs and development log, uc-9
Table 11 community_invitations and eleven tables, UC-9 and UC-15's
note, the Friends, Create Community and Settings screens (.md + .docx);
CLAUDE.md §6; Step 5.5's entry; Phase 5 marked complete.

Co-Authored-By: Claude Opus 5.5 <noreply@anthropic.com>
</commit_message>
<xml_diff>
--- a/docs/frontend screens.docx
+++ b/docs/frontend screens.docx
@@ -324,7 +324,7 @@
         <w:t>Key UI:</w:t>
       </w:r>
       <w:r>
-        <w:t xml:space="preserve"> List of joined Communities (generated cover, name, member count, an "Admin" label where the user is one), newest joined first, and a floating "Create community" button. A bottom tab bar switches between Home, Search, Friends, My List, and Profile; Search is Global Search (2.2), Friends is 2.3 (with a badge counting pending requests, "9+" above nine), My List is 4.1, and Profile is My Profile / Settings (4.3).</w:t>
+        <w:t xml:space="preserve"> List of joined Communities (generated cover, name, member count, an "Admin" label where the user is one), newest joined first, and a floating "Create community" button. A bottom tab bar switches between Home, Search, Friends, My List, and Profile; Search is Global Search (2.2), Friends is 2.3 (with a badge counting pending friend requests and community invitations, "9+" above nine), My List is 4.1, and Profile is My Profile / Settings (4.3).</w:t>
       </w:r>
     </w:p>
     <w:p>
@@ -416,7 +416,7 @@
         <w:t>Key UI:</w:t>
       </w:r>
       <w:r>
-        <w:t xml:space="preserve"> The Friends tab (/friends). "Requests", newest first, each with the sender's name (linking to their profile), when it was sent, "Accept" and "Ignore"; then "Your friends", alphabetical, each linking to their profile, with a ⋯ that opens "Remove friend?" ("Remove {name} from your friends? They won't be notified.", Remove friend / Cancel; UC-8, docs/features/unfriend.md). Accept toasts "You're now friends with {name}."; a request that is gone toasts the server's message and leaves the list. States: skeletons; "No friends yet" with a link to Search; "Couldn't load your friends." with Try again; offline banner with Accept and Ignore disabled (docs/features/friend-requests.md §5.2).</w:t>
+        <w:t xml:space="preserve"> The Friends tab (/friends). "Invitations" to communities first, newest first, each with the community's small cover, name, "{inviter} invited you · {n} members", "Join" (opens the community, toast "You joined {name}.") and "Decline" (docs/features/invite-friends.md §5.4); then "Requests", newest first, each with the sender's name (linking to their profile), when it was sent, "Accept" and "Ignore"; then "Your friends", alphabetical, each linking to their profile, with a ⋯ that opens "Remove friend?" ("Remove {name} from your friends? They won't be notified.", Remove friend / Cancel; UC-8, docs/features/unfriend.md). Accept toasts "You're now friends with {name}."; a request that is gone toasts the server's message and leaves the list. States: skeletons; "No friends yet" with a link to Search; "Couldn't load your friends." with Try again; offline banner with Accept and Ignore disabled (docs/features/friend-requests.md §5.2).</w:t>
       </w:r>
     </w:p>
     <w:p>
@@ -578,7 +578,7 @@
         <w:t>Key UI:</w:t>
       </w:r>
       <w:r>
-        <w:t xml:space="preserve"> A full-screen form (not a modal, so the phone's back gesture works) for Community Name and Description, with a live preview of the generated cover graphic (neutral until the community exists, since its colour comes from the id; no upload control). In place of the friends multi-select, a static "Invite friends" card until friends exist (Phase 5).</w:t>
+        <w:t xml:space="preserve"> A full-screen form (not a modal, so the phone's back gesture works) for Community Name and Description, with a live preview of the generated cover graphic (neutral until the community exists, since its colour comes from the id; no upload control). "Invite friends": the creator's friends, each with a checkbox; the ticked ones are invited once the community exists, and a failure still lands on the community with "Your community is ready, but the invitations weren't sent. Try again from Invite friends." (docs/features/invite-friends.md §5.2).</w:t>
       </w:r>
     </w:p>
     <w:p>
@@ -631,7 +631,7 @@
         <w:t xml:space="preserve">Key UI:</w:t>
       </w:r>
       <w:r>
-        <w:t xml:space="preserve"> Opened from a "Settings" button on the community page. Everyone: the member list (avatar, name, "You", an "Owner" / "Admin" label) and "Leave community" with a confirmation — the Owner instead sees the transfer-or-delete message. Admins: editable name and description with "Save changes"; the invite panel (also on the community page, and opening once by itself after a community is created); a ⋯ menu on rows they may act on — "Make admin", "Make member", "Remove from community" (confirmation; removal also blocks and deletes their posts and ratings here); and a "Blocked" list with "Unblock". The Owner additionally: "Make owner" (confirmation) and "Delete community", confirmed with a warning and an "I understand this can't be undone" checkbox.</w:t>
+        <w:t xml:space="preserve"> Opened from a "Settings" button on the community page. Everyone: the member list (avatar, name, "You", an "Owner" / "Admin" label) and "Leave community" with a confirmation — the Owner instead sees the transfer-or-delete message. Admins: editable name and description with "Save changes"; the invite panel (also on the community page, and opening once by itself after a community is created) — "Friends" first, each friend marked Member, Blocked, Invited (tap to cancel) or with "Invite", then the invite link; a ⋯ menu on rows they may act on — "Make admin", "Make member", "Remove from community" (confirmation; removal also blocks and deletes their posts and ratings here); and a "Blocked" list with "Unblock". The Owner additionally: "Make owner" (confirmation) and "Delete community", confirmed with a warning and an "I understand this can't be undone" checkbox.</w:t>
       </w:r>
     </w:p>
     <w:p>

</xml_diff>